<commit_message>
Se finaliza MAestro de Tolerancias
</commit_message>
<xml_diff>
--- a/documentos/RQM Aprobacion Ajustes OC/PROPUESTA - Aprobacion_OC.docx
+++ b/documentos/RQM Aprobacion Ajustes OC/PROPUESTA - Aprobacion_OC.docx
@@ -871,11 +871,13 @@
             <w:pPr>
               <w:rPr>
                 <w:sz w:val="24"/>
+                <w:highlight w:val="cyan"/>
               </w:rPr>
             </w:pPr>
             <w:r>
               <w:rPr>
                 <w:sz w:val="24"/>
+                <w:highlight w:val="cyan"/>
               </w:rPr>
               <w:t>1</w:t>
             </w:r>
@@ -889,11 +891,13 @@
             <w:pPr>
               <w:rPr>
                 <w:sz w:val="24"/>
+                <w:highlight w:val="cyan"/>
               </w:rPr>
             </w:pPr>
             <w:r>
               <w:rPr>
                 <w:sz w:val="24"/>
+                <w:highlight w:val="cyan"/>
               </w:rPr>
               <w:t>Modelo de datos</w:t>
             </w:r>
@@ -907,12 +911,14 @@
             <w:pPr>
               <w:rPr>
                 <w:sz w:val="24"/>
+                <w:highlight w:val="cyan"/>
                 <w:lang w:val="es-CO"/>
               </w:rPr>
             </w:pPr>
             <w:r>
               <w:rPr>
                 <w:sz w:val="24"/>
+                <w:highlight w:val="cyan"/>
                 <w:lang w:val="es-CO"/>
               </w:rPr>
               <w:t>Nuevo estado, configuración porcentaje, trazabilidad de aprobación</w:t>
@@ -928,11 +934,13 @@
               <w:jc w:val="center"/>
               <w:rPr>
                 <w:sz w:val="24"/>
+                <w:highlight w:val="cyan"/>
               </w:rPr>
             </w:pPr>
             <w:r>
               <w:rPr>
                 <w:sz w:val="24"/>
+                <w:highlight w:val="cyan"/>
               </w:rPr>
               <w:t>8</w:t>
             </w:r>
@@ -948,11 +956,13 @@
             <w:pPr>
               <w:rPr>
                 <w:sz w:val="24"/>
+                <w:highlight w:val="cyan"/>
               </w:rPr>
             </w:pPr>
             <w:r>
               <w:rPr>
                 <w:sz w:val="24"/>
+                <w:highlight w:val="cyan"/>
               </w:rPr>
               <w:t>2</w:t>
             </w:r>
@@ -966,11 +976,13 @@
             <w:pPr>
               <w:rPr>
                 <w:sz w:val="24"/>
+                <w:highlight w:val="cyan"/>
               </w:rPr>
             </w:pPr>
             <w:r>
               <w:rPr>
                 <w:sz w:val="24"/>
+                <w:highlight w:val="cyan"/>
               </w:rPr>
               <w:t>Lógica de negocio</w:t>
             </w:r>
@@ -990,9 +1002,294 @@
             <w:r>
               <w:rPr>
                 <w:sz w:val="24"/>
+                <w:highlight w:val="cyan"/>
                 <w:lang w:val="es-CO"/>
               </w:rPr>
-              <w:t>Validación de diferencias y bloqueo de confirmación</w:t>
+              <w:t>Validación de diferencias</w:t>
+            </w:r>
+            <w:r>
+              <w:rPr>
+                <w:sz w:val="24"/>
+                <w:lang w:val="es-CO"/>
+              </w:rPr>
+              <w:t xml:space="preserve"> </w:t>
+            </w:r>
+            <w:bookmarkStart w:id="0" w:name="_GoBack"/>
+            <w:r>
+              <w:rPr>
+                <w:sz w:val="24"/>
+                <w:highlight w:val="yellow"/>
+                <w:lang w:val="es-CO"/>
+              </w:rPr>
+              <w:t>y bloqueo de confirmación</w:t>
+            </w:r>
+            <w:bookmarkEnd w:id="0"/>
+          </w:p>
+        </w:tc>
+        <w:tc>
+          <w:tcPr>
+            <w:tcW w:w="1302" w:type="dxa"/>
+          </w:tcPr>
+          <w:p>
+            <w:pPr>
+              <w:jc w:val="center"/>
+              <w:rPr>
+                <w:sz w:val="24"/>
+              </w:rPr>
+            </w:pPr>
+            <w:r>
+              <w:rPr>
+                <w:sz w:val="24"/>
+              </w:rPr>
+              <w:t>4</w:t>
+            </w:r>
+          </w:p>
+        </w:tc>
+      </w:tr>
+      <w:tr>
+        <w:tc>
+          <w:tcPr>
+            <w:tcW w:w="2160" w:type="dxa"/>
+          </w:tcPr>
+          <w:p>
+            <w:pPr>
+              <w:rPr>
+                <w:sz w:val="24"/>
+                <w:highlight w:val="cyan"/>
+              </w:rPr>
+            </w:pPr>
+            <w:r>
+              <w:rPr>
+                <w:sz w:val="24"/>
+                <w:highlight w:val="cyan"/>
+              </w:rPr>
+              <w:t>2A</w:t>
+            </w:r>
+          </w:p>
+        </w:tc>
+        <w:tc>
+          <w:tcPr>
+            <w:tcW w:w="2160" w:type="dxa"/>
+          </w:tcPr>
+          <w:p>
+            <w:pPr>
+              <w:rPr>
+                <w:sz w:val="24"/>
+                <w:highlight w:val="cyan"/>
+              </w:rPr>
+            </w:pPr>
+          </w:p>
+        </w:tc>
+        <w:tc>
+          <w:tcPr>
+            <w:tcW w:w="3018" w:type="dxa"/>
+          </w:tcPr>
+          <w:p>
+            <w:pPr>
+              <w:rPr>
+                <w:sz w:val="24"/>
+                <w:highlight w:val="cyan"/>
+                <w:lang w:val="es-CO"/>
+              </w:rPr>
+            </w:pPr>
+            <w:proofErr w:type="spellStart"/>
+            <w:r>
+              <w:rPr>
+                <w:sz w:val="24"/>
+                <w:highlight w:val="cyan"/>
+                <w:lang w:val="es-CO"/>
+              </w:rPr>
+              <w:t>Configuracion</w:t>
+            </w:r>
+            <w:proofErr w:type="spellEnd"/>
+            <w:r>
+              <w:rPr>
+                <w:sz w:val="24"/>
+                <w:highlight w:val="cyan"/>
+                <w:lang w:val="es-CO"/>
+              </w:rPr>
+              <w:t xml:space="preserve"> </w:t>
+            </w:r>
+            <w:proofErr w:type="spellStart"/>
+            <w:r>
+              <w:rPr>
+                <w:sz w:val="24"/>
+                <w:highlight w:val="cyan"/>
+                <w:lang w:val="es-CO"/>
+              </w:rPr>
+              <w:t>de</w:t>
+            </w:r>
+            <w:proofErr w:type="spellEnd"/>
+            <w:r>
+              <w:rPr>
+                <w:sz w:val="24"/>
+                <w:highlight w:val="cyan"/>
+                <w:lang w:val="es-CO"/>
+              </w:rPr>
+              <w:t xml:space="preserve"> % y Pantalla</w:t>
+            </w:r>
+          </w:p>
+        </w:tc>
+        <w:tc>
+          <w:tcPr>
+            <w:tcW w:w="1302" w:type="dxa"/>
+          </w:tcPr>
+          <w:p>
+            <w:pPr>
+              <w:jc w:val="center"/>
+              <w:rPr>
+                <w:sz w:val="24"/>
+              </w:rPr>
+            </w:pPr>
+            <w:r>
+              <w:rPr>
+                <w:sz w:val="24"/>
+              </w:rPr>
+              <w:t>8</w:t>
+            </w:r>
+          </w:p>
+        </w:tc>
+      </w:tr>
+      <w:tr>
+        <w:tc>
+          <w:tcPr>
+            <w:tcW w:w="2160" w:type="dxa"/>
+          </w:tcPr>
+          <w:p>
+            <w:pPr>
+              <w:rPr>
+                <w:sz w:val="24"/>
+                <w:highlight w:val="cyan"/>
+              </w:rPr>
+            </w:pPr>
+            <w:r>
+              <w:rPr>
+                <w:sz w:val="24"/>
+                <w:highlight w:val="cyan"/>
+              </w:rPr>
+              <w:t>2B</w:t>
+            </w:r>
+          </w:p>
+        </w:tc>
+        <w:tc>
+          <w:tcPr>
+            <w:tcW w:w="2160" w:type="dxa"/>
+          </w:tcPr>
+          <w:p>
+            <w:pPr>
+              <w:rPr>
+                <w:sz w:val="24"/>
+                <w:highlight w:val="cyan"/>
+              </w:rPr>
+            </w:pPr>
+          </w:p>
+        </w:tc>
+        <w:tc>
+          <w:tcPr>
+            <w:tcW w:w="3018" w:type="dxa"/>
+          </w:tcPr>
+          <w:p>
+            <w:pPr>
+              <w:rPr>
+                <w:sz w:val="24"/>
+                <w:highlight w:val="cyan"/>
+                <w:lang w:val="es-CO"/>
+              </w:rPr>
+            </w:pPr>
+            <w:proofErr w:type="spellStart"/>
+            <w:r>
+              <w:rPr>
+                <w:sz w:val="24"/>
+                <w:highlight w:val="cyan"/>
+                <w:lang w:val="es-CO"/>
+              </w:rPr>
+              <w:t>Configuracion</w:t>
+            </w:r>
+            <w:proofErr w:type="spellEnd"/>
+            <w:r>
+              <w:rPr>
+                <w:sz w:val="24"/>
+                <w:highlight w:val="cyan"/>
+                <w:lang w:val="es-CO"/>
+              </w:rPr>
+              <w:t xml:space="preserve"> de Aprobadores</w:t>
+            </w:r>
+          </w:p>
+        </w:tc>
+        <w:tc>
+          <w:tcPr>
+            <w:tcW w:w="1302" w:type="dxa"/>
+          </w:tcPr>
+          <w:p>
+            <w:pPr>
+              <w:jc w:val="center"/>
+              <w:rPr>
+                <w:sz w:val="24"/>
+              </w:rPr>
+            </w:pPr>
+            <w:r>
+              <w:rPr>
+                <w:sz w:val="24"/>
+              </w:rPr>
+              <w:t>2</w:t>
+            </w:r>
+          </w:p>
+        </w:tc>
+      </w:tr>
+      <w:tr>
+        <w:tc>
+          <w:tcPr>
+            <w:tcW w:w="2160" w:type="dxa"/>
+          </w:tcPr>
+          <w:p>
+            <w:pPr>
+              <w:rPr>
+                <w:sz w:val="24"/>
+              </w:rPr>
+            </w:pPr>
+            <w:r>
+              <w:rPr>
+                <w:sz w:val="24"/>
+              </w:rPr>
+              <w:t>3</w:t>
+            </w:r>
+          </w:p>
+        </w:tc>
+        <w:tc>
+          <w:tcPr>
+            <w:tcW w:w="2160" w:type="dxa"/>
+          </w:tcPr>
+          <w:p>
+            <w:pPr>
+              <w:rPr>
+                <w:sz w:val="24"/>
+              </w:rPr>
+            </w:pPr>
+            <w:r>
+              <w:rPr>
+                <w:sz w:val="24"/>
+              </w:rPr>
+              <w:t>Flujo de aprobación</w:t>
+            </w:r>
+          </w:p>
+        </w:tc>
+        <w:tc>
+          <w:tcPr>
+            <w:tcW w:w="3018" w:type="dxa"/>
+          </w:tcPr>
+          <w:p>
+            <w:pPr>
+              <w:rPr>
+                <w:sz w:val="24"/>
+                <w:lang w:val="es-CO"/>
+              </w:rPr>
+            </w:pPr>
+            <w:r>
+              <w:rPr>
+                <w:sz w:val="24"/>
+                <w:lang w:val="es-CO"/>
+              </w:rPr>
+              <w:t>Aprobar o devolver orden, captura de motivo</w:t>
             </w:r>
           </w:p>
         </w:tc>
@@ -1031,7 +1328,7 @@
               <w:rPr>
                 <w:sz w:val="24"/>
               </w:rPr>
-              <w:t>3</w:t>
+              <w:t>4</w:t>
             </w:r>
           </w:p>
         </w:tc>
@@ -1049,7 +1346,7 @@
               <w:rPr>
                 <w:sz w:val="24"/>
               </w:rPr>
-              <w:t>Flujo de aprobación</w:t>
+              <w:t>Seguridad y perfiles</w:t>
             </w:r>
           </w:p>
         </w:tc>
@@ -1069,7 +1366,84 @@
                 <w:sz w:val="24"/>
                 <w:lang w:val="es-CO"/>
               </w:rPr>
-              <w:t>Aprobar o devolver orden, captura de motivo</w:t>
+              <w:t>Perfil aprobador y restricciones de edición</w:t>
+            </w:r>
+          </w:p>
+        </w:tc>
+        <w:tc>
+          <w:tcPr>
+            <w:tcW w:w="1302" w:type="dxa"/>
+          </w:tcPr>
+          <w:p>
+            <w:pPr>
+              <w:jc w:val="center"/>
+              <w:rPr>
+                <w:sz w:val="24"/>
+              </w:rPr>
+            </w:pPr>
+            <w:r>
+              <w:rPr>
+                <w:sz w:val="24"/>
+              </w:rPr>
+              <w:t>8</w:t>
+            </w:r>
+          </w:p>
+        </w:tc>
+      </w:tr>
+      <w:tr>
+        <w:tc>
+          <w:tcPr>
+            <w:tcW w:w="2160" w:type="dxa"/>
+          </w:tcPr>
+          <w:p>
+            <w:pPr>
+              <w:rPr>
+                <w:sz w:val="24"/>
+              </w:rPr>
+            </w:pPr>
+            <w:r>
+              <w:rPr>
+                <w:sz w:val="24"/>
+              </w:rPr>
+              <w:t>5</w:t>
+            </w:r>
+          </w:p>
+        </w:tc>
+        <w:tc>
+          <w:tcPr>
+            <w:tcW w:w="2160" w:type="dxa"/>
+          </w:tcPr>
+          <w:p>
+            <w:pPr>
+              <w:rPr>
+                <w:sz w:val="24"/>
+              </w:rPr>
+            </w:pPr>
+            <w:r>
+              <w:rPr>
+                <w:sz w:val="24"/>
+              </w:rPr>
+              <w:t>UI Órdenes de Compra</w:t>
+            </w:r>
+          </w:p>
+        </w:tc>
+        <w:tc>
+          <w:tcPr>
+            <w:tcW w:w="3018" w:type="dxa"/>
+          </w:tcPr>
+          <w:p>
+            <w:pPr>
+              <w:rPr>
+                <w:sz w:val="24"/>
+                <w:lang w:val="es-CO"/>
+              </w:rPr>
+            </w:pPr>
+            <w:r>
+              <w:rPr>
+                <w:sz w:val="24"/>
+                <w:lang w:val="es-CO"/>
+              </w:rPr>
+              <w:t>Mensajes, vistas y bloqueo de edición</w:t>
             </w:r>
           </w:p>
         </w:tc>
@@ -1108,7 +1482,7 @@
               <w:rPr>
                 <w:sz w:val="24"/>
               </w:rPr>
-              <w:t>4</w:t>
+              <w:t>6</w:t>
             </w:r>
           </w:p>
         </w:tc>
@@ -1126,7 +1500,7 @@
               <w:rPr>
                 <w:sz w:val="24"/>
               </w:rPr>
-              <w:t>Seguridad y perfiles</w:t>
+              <w:t>Consulta Pendientes de Aprobación</w:t>
             </w:r>
           </w:p>
         </w:tc>
@@ -1138,15 +1512,13 @@
             <w:pPr>
               <w:rPr>
                 <w:sz w:val="24"/>
-                <w:lang w:val="es-CO"/>
               </w:rPr>
             </w:pPr>
             <w:r>
               <w:rPr>
                 <w:sz w:val="24"/>
-                <w:lang w:val="es-CO"/>
-              </w:rPr>
-              <w:t>Perfil aprobador y restricciones de edición</w:t>
+              </w:rPr>
+              <w:t>Listado exclusivo para aprobadores</w:t>
             </w:r>
           </w:p>
         </w:tc>
@@ -1185,7 +1557,7 @@
               <w:rPr>
                 <w:sz w:val="24"/>
               </w:rPr>
-              <w:t>5</w:t>
+              <w:t>7</w:t>
             </w:r>
           </w:p>
         </w:tc>
@@ -1203,7 +1575,7 @@
               <w:rPr>
                 <w:sz w:val="24"/>
               </w:rPr>
-              <w:t>UI Órdenes de Compra</w:t>
+              <w:t>Alertas</w:t>
             </w:r>
           </w:p>
         </w:tc>
@@ -1223,7 +1595,159 @@
                 <w:sz w:val="24"/>
                 <w:lang w:val="es-CO"/>
               </w:rPr>
-              <w:t>Mensajes, vistas y bloqueo de edición</w:t>
+              <w:t>Indicador de órdenes pendientes para aprobar</w:t>
+            </w:r>
+          </w:p>
+        </w:tc>
+        <w:tc>
+          <w:tcPr>
+            <w:tcW w:w="1302" w:type="dxa"/>
+          </w:tcPr>
+          <w:p>
+            <w:pPr>
+              <w:jc w:val="center"/>
+              <w:rPr>
+                <w:sz w:val="24"/>
+              </w:rPr>
+            </w:pPr>
+            <w:r>
+              <w:rPr>
+                <w:sz w:val="24"/>
+              </w:rPr>
+              <w:t>8</w:t>
+            </w:r>
+          </w:p>
+        </w:tc>
+      </w:tr>
+      <w:tr>
+        <w:tc>
+          <w:tcPr>
+            <w:tcW w:w="2160" w:type="dxa"/>
+          </w:tcPr>
+          <w:p>
+            <w:pPr>
+              <w:rPr>
+                <w:sz w:val="24"/>
+              </w:rPr>
+            </w:pPr>
+            <w:r>
+              <w:rPr>
+                <w:sz w:val="24"/>
+              </w:rPr>
+              <w:t>8</w:t>
+            </w:r>
+          </w:p>
+        </w:tc>
+        <w:tc>
+          <w:tcPr>
+            <w:tcW w:w="2160" w:type="dxa"/>
+          </w:tcPr>
+          <w:p>
+            <w:pPr>
+              <w:rPr>
+                <w:sz w:val="24"/>
+              </w:rPr>
+            </w:pPr>
+            <w:r>
+              <w:rPr>
+                <w:sz w:val="24"/>
+              </w:rPr>
+              <w:t>Auditoría</w:t>
+            </w:r>
+          </w:p>
+        </w:tc>
+        <w:tc>
+          <w:tcPr>
+            <w:tcW w:w="3018" w:type="dxa"/>
+          </w:tcPr>
+          <w:p>
+            <w:pPr>
+              <w:rPr>
+                <w:sz w:val="24"/>
+                <w:lang w:val="es-CO"/>
+              </w:rPr>
+            </w:pPr>
+            <w:r>
+              <w:rPr>
+                <w:sz w:val="24"/>
+                <w:lang w:val="es-CO"/>
+              </w:rPr>
+              <w:t>Registro de aprobador, fecha y motivo</w:t>
+            </w:r>
+          </w:p>
+        </w:tc>
+        <w:tc>
+          <w:tcPr>
+            <w:tcW w:w="1302" w:type="dxa"/>
+          </w:tcPr>
+          <w:p>
+            <w:pPr>
+              <w:jc w:val="center"/>
+              <w:rPr>
+                <w:sz w:val="24"/>
+              </w:rPr>
+            </w:pPr>
+            <w:r>
+              <w:rPr>
+                <w:sz w:val="24"/>
+              </w:rPr>
+              <w:t>6</w:t>
+            </w:r>
+          </w:p>
+        </w:tc>
+      </w:tr>
+      <w:tr>
+        <w:tc>
+          <w:tcPr>
+            <w:tcW w:w="2160" w:type="dxa"/>
+          </w:tcPr>
+          <w:p>
+            <w:pPr>
+              <w:rPr>
+                <w:sz w:val="24"/>
+              </w:rPr>
+            </w:pPr>
+            <w:r>
+              <w:rPr>
+                <w:sz w:val="24"/>
+              </w:rPr>
+              <w:t>9</w:t>
+            </w:r>
+          </w:p>
+        </w:tc>
+        <w:tc>
+          <w:tcPr>
+            <w:tcW w:w="2160" w:type="dxa"/>
+          </w:tcPr>
+          <w:p>
+            <w:pPr>
+              <w:rPr>
+                <w:sz w:val="24"/>
+              </w:rPr>
+            </w:pPr>
+            <w:r>
+              <w:rPr>
+                <w:sz w:val="24"/>
+              </w:rPr>
+              <w:t>Pruebas integrales</w:t>
+            </w:r>
+          </w:p>
+        </w:tc>
+        <w:tc>
+          <w:tcPr>
+            <w:tcW w:w="3018" w:type="dxa"/>
+          </w:tcPr>
+          <w:p>
+            <w:pPr>
+              <w:rPr>
+                <w:sz w:val="24"/>
+              </w:rPr>
+            </w:pPr>
+            <w:r>
+              <w:rPr>
+                <w:sz w:val="24"/>
+              </w:rPr>
+              <w:t>Pruebas funcionales y regresión</w:t>
             </w:r>
           </w:p>
         </w:tc>
@@ -1262,310 +1786,6 @@
               <w:rPr>
                 <w:sz w:val="24"/>
               </w:rPr>
-              <w:t>6</w:t>
-            </w:r>
-          </w:p>
-        </w:tc>
-        <w:tc>
-          <w:tcPr>
-            <w:tcW w:w="2160" w:type="dxa"/>
-          </w:tcPr>
-          <w:p>
-            <w:pPr>
-              <w:rPr>
-                <w:sz w:val="24"/>
-              </w:rPr>
-            </w:pPr>
-            <w:r>
-              <w:rPr>
-                <w:sz w:val="24"/>
-              </w:rPr>
-              <w:t>Consulta Pendientes de Aprobación</w:t>
-            </w:r>
-          </w:p>
-        </w:tc>
-        <w:tc>
-          <w:tcPr>
-            <w:tcW w:w="3018" w:type="dxa"/>
-          </w:tcPr>
-          <w:p>
-            <w:pPr>
-              <w:rPr>
-                <w:sz w:val="24"/>
-              </w:rPr>
-            </w:pPr>
-            <w:r>
-              <w:rPr>
-                <w:sz w:val="24"/>
-              </w:rPr>
-              <w:t>Listado exclusivo para aprobadores</w:t>
-            </w:r>
-          </w:p>
-        </w:tc>
-        <w:tc>
-          <w:tcPr>
-            <w:tcW w:w="1302" w:type="dxa"/>
-          </w:tcPr>
-          <w:p>
-            <w:pPr>
-              <w:jc w:val="center"/>
-              <w:rPr>
-                <w:sz w:val="24"/>
-              </w:rPr>
-            </w:pPr>
-            <w:r>
-              <w:rPr>
-                <w:sz w:val="24"/>
-              </w:rPr>
-              <w:t>8</w:t>
-            </w:r>
-          </w:p>
-        </w:tc>
-      </w:tr>
-      <w:tr>
-        <w:tc>
-          <w:tcPr>
-            <w:tcW w:w="2160" w:type="dxa"/>
-          </w:tcPr>
-          <w:p>
-            <w:pPr>
-              <w:rPr>
-                <w:sz w:val="24"/>
-              </w:rPr>
-            </w:pPr>
-            <w:r>
-              <w:rPr>
-                <w:sz w:val="24"/>
-              </w:rPr>
-              <w:t>7</w:t>
-            </w:r>
-          </w:p>
-        </w:tc>
-        <w:tc>
-          <w:tcPr>
-            <w:tcW w:w="2160" w:type="dxa"/>
-          </w:tcPr>
-          <w:p>
-            <w:pPr>
-              <w:rPr>
-                <w:sz w:val="24"/>
-              </w:rPr>
-            </w:pPr>
-            <w:r>
-              <w:rPr>
-                <w:sz w:val="24"/>
-              </w:rPr>
-              <w:t>Alertas</w:t>
-            </w:r>
-          </w:p>
-        </w:tc>
-        <w:tc>
-          <w:tcPr>
-            <w:tcW w:w="3018" w:type="dxa"/>
-          </w:tcPr>
-          <w:p>
-            <w:pPr>
-              <w:rPr>
-                <w:sz w:val="24"/>
-                <w:lang w:val="es-CO"/>
-              </w:rPr>
-            </w:pPr>
-            <w:r>
-              <w:rPr>
-                <w:sz w:val="24"/>
-                <w:lang w:val="es-CO"/>
-              </w:rPr>
-              <w:t>Indicador de órdenes pendientes para aprobar</w:t>
-            </w:r>
-          </w:p>
-        </w:tc>
-        <w:tc>
-          <w:tcPr>
-            <w:tcW w:w="1302" w:type="dxa"/>
-          </w:tcPr>
-          <w:p>
-            <w:pPr>
-              <w:jc w:val="center"/>
-              <w:rPr>
-                <w:sz w:val="24"/>
-              </w:rPr>
-            </w:pPr>
-            <w:r>
-              <w:rPr>
-                <w:sz w:val="24"/>
-              </w:rPr>
-              <w:t>8</w:t>
-            </w:r>
-          </w:p>
-        </w:tc>
-      </w:tr>
-      <w:tr>
-        <w:tc>
-          <w:tcPr>
-            <w:tcW w:w="2160" w:type="dxa"/>
-          </w:tcPr>
-          <w:p>
-            <w:pPr>
-              <w:rPr>
-                <w:sz w:val="24"/>
-              </w:rPr>
-            </w:pPr>
-            <w:r>
-              <w:rPr>
-                <w:sz w:val="24"/>
-              </w:rPr>
-              <w:t>8</w:t>
-            </w:r>
-          </w:p>
-        </w:tc>
-        <w:tc>
-          <w:tcPr>
-            <w:tcW w:w="2160" w:type="dxa"/>
-          </w:tcPr>
-          <w:p>
-            <w:pPr>
-              <w:rPr>
-                <w:sz w:val="24"/>
-              </w:rPr>
-            </w:pPr>
-            <w:r>
-              <w:rPr>
-                <w:sz w:val="24"/>
-              </w:rPr>
-              <w:t>Auditoría</w:t>
-            </w:r>
-          </w:p>
-        </w:tc>
-        <w:tc>
-          <w:tcPr>
-            <w:tcW w:w="3018" w:type="dxa"/>
-          </w:tcPr>
-          <w:p>
-            <w:pPr>
-              <w:rPr>
-                <w:sz w:val="24"/>
-                <w:lang w:val="es-CO"/>
-              </w:rPr>
-            </w:pPr>
-            <w:r>
-              <w:rPr>
-                <w:sz w:val="24"/>
-                <w:lang w:val="es-CO"/>
-              </w:rPr>
-              <w:t>Registro de aprobador, fecha y motivo</w:t>
-            </w:r>
-          </w:p>
-        </w:tc>
-        <w:tc>
-          <w:tcPr>
-            <w:tcW w:w="1302" w:type="dxa"/>
-          </w:tcPr>
-          <w:p>
-            <w:pPr>
-              <w:jc w:val="center"/>
-              <w:rPr>
-                <w:sz w:val="24"/>
-              </w:rPr>
-            </w:pPr>
-            <w:r>
-              <w:rPr>
-                <w:sz w:val="24"/>
-              </w:rPr>
-              <w:t>6</w:t>
-            </w:r>
-          </w:p>
-        </w:tc>
-      </w:tr>
-      <w:tr>
-        <w:tc>
-          <w:tcPr>
-            <w:tcW w:w="2160" w:type="dxa"/>
-          </w:tcPr>
-          <w:p>
-            <w:pPr>
-              <w:rPr>
-                <w:sz w:val="24"/>
-              </w:rPr>
-            </w:pPr>
-            <w:r>
-              <w:rPr>
-                <w:sz w:val="24"/>
-              </w:rPr>
-              <w:t>9</w:t>
-            </w:r>
-          </w:p>
-        </w:tc>
-        <w:tc>
-          <w:tcPr>
-            <w:tcW w:w="2160" w:type="dxa"/>
-          </w:tcPr>
-          <w:p>
-            <w:pPr>
-              <w:rPr>
-                <w:sz w:val="24"/>
-              </w:rPr>
-            </w:pPr>
-            <w:r>
-              <w:rPr>
-                <w:sz w:val="24"/>
-              </w:rPr>
-              <w:t>Pruebas integrales</w:t>
-            </w:r>
-          </w:p>
-        </w:tc>
-        <w:tc>
-          <w:tcPr>
-            <w:tcW w:w="3018" w:type="dxa"/>
-          </w:tcPr>
-          <w:p>
-            <w:pPr>
-              <w:rPr>
-                <w:sz w:val="24"/>
-              </w:rPr>
-            </w:pPr>
-            <w:r>
-              <w:rPr>
-                <w:sz w:val="24"/>
-              </w:rPr>
-              <w:t>Pruebas funcionales y regresión</w:t>
-            </w:r>
-          </w:p>
-        </w:tc>
-        <w:tc>
-          <w:tcPr>
-            <w:tcW w:w="1302" w:type="dxa"/>
-          </w:tcPr>
-          <w:p>
-            <w:pPr>
-              <w:jc w:val="center"/>
-              <w:rPr>
-                <w:sz w:val="24"/>
-              </w:rPr>
-            </w:pPr>
-            <w:r>
-              <w:rPr>
-                <w:sz w:val="24"/>
-              </w:rPr>
-              <w:t>12</w:t>
-            </w:r>
-          </w:p>
-        </w:tc>
-      </w:tr>
-      <w:tr>
-        <w:tc>
-          <w:tcPr>
-            <w:tcW w:w="2160" w:type="dxa"/>
-          </w:tcPr>
-          <w:p>
-            <w:pPr>
-              <w:rPr>
-                <w:sz w:val="24"/>
-              </w:rPr>
-            </w:pPr>
-            <w:r>
-              <w:rPr>
-                <w:sz w:val="24"/>
-              </w:rPr>
               <w:t>10</w:t>
             </w:r>
           </w:p>
@@ -1649,6 +1869,7 @@
           <w:sz w:val="24"/>
           <w:lang w:val="es-CO"/>
         </w:rPr>
+        <w:lastRenderedPageBreak/>
         <w:t>Total estimado: 90 horas de desarrollo. Incluye análisis, desarrollo, pruebas y estabilización funcional.</w:t>
       </w:r>
     </w:p>
@@ -1665,7 +1886,6 @@
           <w:sz w:val="32"/>
           <w:lang w:val="es-CO"/>
         </w:rPr>
-        <w:lastRenderedPageBreak/>
         <w:t>5. Consideraciones</w:t>
       </w:r>
     </w:p>
@@ -2663,7 +2883,6 @@
           <w:sz w:val="32"/>
           <w:lang w:val="es-CO"/>
         </w:rPr>
-        <w:lastRenderedPageBreak/>
         <w:t xml:space="preserve">7. </w:t>
       </w:r>
       <w:r>
@@ -3228,8 +3447,6 @@
           <w:lang w:val="es-CO"/>
         </w:rPr>
       </w:pPr>
-      <w:bookmarkStart w:id="0" w:name="_GoBack"/>
-      <w:bookmarkEnd w:id="0"/>
     </w:p>
     <w:p>
       <w:pPr>
@@ -3502,6 +3719,7 @@
           <w:szCs w:val="24"/>
           <w:lang w:val="es-CO"/>
         </w:rPr>
+        <w:lastRenderedPageBreak/>
         <w:t xml:space="preserve">La garantía empieza a contar una vez se termine el ciclo de estabilización descrito en esta propuesta. La fecha de salida a producción o controles de cambio sobre el sistema no extienden dicho período de garantía. </w:t>
       </w:r>
     </w:p>
@@ -3522,7 +3740,6 @@
           <w:szCs w:val="24"/>
           <w:lang w:val="es-CO"/>
         </w:rPr>
-        <w:lastRenderedPageBreak/>
         <w:t xml:space="preserve">En caso de que el sistema sea modificado por terceros la garantía se anulará inmediatamente. </w:t>
       </w:r>
     </w:p>
@@ -3953,6 +4170,7 @@
           <w:szCs w:val="24"/>
           <w:lang w:val="es-CO"/>
         </w:rPr>
+        <w:lastRenderedPageBreak/>
         <w:t xml:space="preserve"> </w:t>
       </w:r>
     </w:p>
@@ -16132,7 +16350,7 @@
 </file>
 
 <file path=customXml/itemProps1.xml><?xml version="1.0" encoding="utf-8"?>
-<ds:datastoreItem xmlns:ds="http://schemas.openxmlformats.org/officeDocument/2006/customXml" ds:itemID="{6A61CC69-7724-4846-B66D-8D34D6A441E4}">
+<ds:datastoreItem xmlns:ds="http://schemas.openxmlformats.org/officeDocument/2006/customXml" ds:itemID="{3889509B-D4A2-402E-A0BC-324C3D8756F8}">
   <ds:schemaRefs>
     <ds:schemaRef ds:uri="http://schemas.openxmlformats.org/officeDocument/2006/bibliography"/>
   </ds:schemaRefs>

</xml_diff>

<commit_message>
Implementacion del DashBoard para La aprobacion de los ajustes de Ordenes de compra, llamando a ConfirmPurchaseOrder, con estado Aprobacion, para modificar elcomportamiento de la pagina.
Tambien se reconstruye el guardado de la edicion de Ordenes de compra para no generar un nuevo detalle siempre sino mantener los detalles cuando son editados y solo generar nuevos cuando se agregan .
</commit_message>
<xml_diff>
--- a/documentos/RQM Aprobacion Ajustes OC/PROPUESTA - Aprobacion_OC.docx
+++ b/documentos/RQM Aprobacion Ajustes OC/PROPUESTA - Aprobacion_OC.docx
@@ -1014,16 +1014,14 @@
               </w:rPr>
               <w:t xml:space="preserve"> </w:t>
             </w:r>
-            <w:bookmarkStart w:id="0" w:name="_GoBack"/>
             <w:r>
               <w:rPr>
                 <w:sz w:val="24"/>
-                <w:highlight w:val="yellow"/>
+                <w:highlight w:val="cyan"/>
                 <w:lang w:val="es-CO"/>
               </w:rPr>
               <w:t>y bloqueo de confirmación</w:t>
             </w:r>
-            <w:bookmarkEnd w:id="0"/>
           </w:p>
         </w:tc>
         <w:tc>
@@ -1289,7 +1287,16 @@
                 <w:sz w:val="24"/>
                 <w:lang w:val="es-CO"/>
               </w:rPr>
-              <w:t>Aprobar o devolver orden, captura de motivo</w:t>
+              <w:t>Aprobar o devolver orden, captura de mo</w:t>
+            </w:r>
+            <w:bookmarkStart w:id="0" w:name="_GoBack"/>
+            <w:bookmarkEnd w:id="0"/>
+            <w:r>
+              <w:rPr>
+                <w:sz w:val="24"/>
+                <w:lang w:val="es-CO"/>
+              </w:rPr>
+              <w:t>tivo</w:t>
             </w:r>
           </w:p>
         </w:tc>
@@ -16350,7 +16357,7 @@
 </file>
 
 <file path=customXml/itemProps1.xml><?xml version="1.0" encoding="utf-8"?>
-<ds:datastoreItem xmlns:ds="http://schemas.openxmlformats.org/officeDocument/2006/customXml" ds:itemID="{3889509B-D4A2-402E-A0BC-324C3D8756F8}">
+<ds:datastoreItem xmlns:ds="http://schemas.openxmlformats.org/officeDocument/2006/customXml" ds:itemID="{4C94EB14-CD52-4849-8C26-3C7EC2685CCC}">
   <ds:schemaRefs>
     <ds:schemaRef ds:uri="http://schemas.openxmlformats.org/officeDocument/2006/bibliography"/>
   </ds:schemaRefs>

</xml_diff>